<commit_message>
docs: fix Annexe B file descriptions in technical report
Co-Authored-By: Claude Sonnet 4.6 <noreply@anthropic.com>
</commit_message>
<xml_diff>
--- a/rapport_technique_RAG.docx
+++ b/rapport_technique_RAG.docx
@@ -59,15 +59,7 @@
         <w:jc w:val="center"/>
       </w:pPr>
       <w:r>
-        <w:t>Puls-</w:t>
-      </w:r>
-      <w:proofErr w:type="spellStart"/>
-      <w:r>
-        <w:t>Events</w:t>
-      </w:r>
-      <w:proofErr w:type="spellEnd"/>
-      <w:r>
-        <w:t xml:space="preserve"> | Périmètre géographique : Rennes</w:t>
+        <w:t>Puls-Events | Périmètre géographique : Rennes</w:t>
       </w:r>
     </w:p>
     <w:p>
@@ -112,28 +104,15 @@
         <w:pStyle w:val="Titre2"/>
       </w:pPr>
       <w:r>
-        <w:t>1.1 Présentation de Puls-</w:t>
-      </w:r>
-      <w:proofErr w:type="spellStart"/>
-      <w:r>
-        <w:t>Events</w:t>
-      </w:r>
-      <w:proofErr w:type="spellEnd"/>
+        <w:t>1.1 Présentation de Puls-Events</w:t>
+      </w:r>
     </w:p>
     <w:p>
       <w:pPr>
         <w:spacing w:after="160"/>
       </w:pPr>
       <w:r>
-        <w:t>Puls-</w:t>
-      </w:r>
-      <w:proofErr w:type="spellStart"/>
-      <w:r>
-        <w:t>Events</w:t>
-      </w:r>
-      <w:proofErr w:type="spellEnd"/>
-      <w:r>
-        <w:t xml:space="preserve"> est une plateforme web innovante permettant aux utilisateurs de découvrir et de suivre des événements culturels en temps réel. Elle collecte des informations à partir de sources publiques — notamment Open Agenda — pour proposer des événements filtrables par lieu et par période.</w:t>
+        <w:t>Puls-Events est une plateforme web innovante permettant aux utilisateurs de découvrir et de suivre des événements culturels en temps réel. Elle collecte des informations à partir de sources publiques — notamment Open Agenda — pour proposer des événements filtrables par lieu et par période.</w:t>
       </w:r>
     </w:p>
     <w:p>
@@ -199,31 +178,7 @@
         <w:spacing w:after="100"/>
       </w:pPr>
       <w:r>
-        <w:t xml:space="preserve">Interface </w:t>
-      </w:r>
-      <w:proofErr w:type="spellStart"/>
-      <w:r>
-        <w:t>chatbot</w:t>
-      </w:r>
-      <w:proofErr w:type="spellEnd"/>
-      <w:r>
-        <w:t xml:space="preserve"> </w:t>
-      </w:r>
-      <w:proofErr w:type="spellStart"/>
-      <w:r>
-        <w:t>Streamlit</w:t>
-      </w:r>
-      <w:proofErr w:type="spellEnd"/>
-      <w:r>
-        <w:t xml:space="preserve"> déployable sur </w:t>
-      </w:r>
-      <w:proofErr w:type="spellStart"/>
-      <w:r>
-        <w:t>Streamlit</w:t>
-      </w:r>
-      <w:proofErr w:type="spellEnd"/>
-      <w:r>
-        <w:t xml:space="preserve"> Cloud</w:t>
+        <w:t>Interface chatbot Streamlit déployable sur Streamlit Cloud</w:t>
       </w:r>
     </w:p>
     <w:p>
@@ -466,25 +421,7 @@
                 <w:sz w:val="20"/>
                 <w:szCs w:val="20"/>
               </w:rPr>
-              <w:t xml:space="preserve">Récupération des événements Open Agenda → nettoyage → </w:t>
-            </w:r>
-            <w:proofErr w:type="spellStart"/>
-            <w:r>
-              <w:rPr>
-                <w:color w:val="000000"/>
-                <w:sz w:val="20"/>
-                <w:szCs w:val="20"/>
-              </w:rPr>
-              <w:t>chunking</w:t>
-            </w:r>
-            <w:proofErr w:type="spellEnd"/>
-            <w:r>
-              <w:rPr>
-                <w:color w:val="000000"/>
-                <w:sz w:val="20"/>
-                <w:szCs w:val="20"/>
-              </w:rPr>
-              <w:t xml:space="preserve"> → embeddings Mistral → index FAISS</w:t>
+              <w:t>Récupération des événements Open Agenda → nettoyage → chunking → embeddings Mistral → index FAISS</w:t>
             </w:r>
           </w:p>
         </w:tc>
@@ -731,7 +668,7 @@
                 <w:sz w:val="20"/>
                 <w:szCs w:val="20"/>
               </w:rPr>
-              <w:t>Ingestion</w:t>
+              <w:t>Collecte</w:t>
             </w:r>
           </w:p>
         </w:tc>
@@ -759,7 +696,7 @@
                 <w:sz w:val="20"/>
                 <w:szCs w:val="20"/>
               </w:rPr>
-              <w:t>src/ingestion.py</w:t>
+              <w:t>src/data_collection/open_agenda_client.py</w:t>
             </w:r>
           </w:p>
         </w:tc>
@@ -817,7 +754,6 @@
             </w:tcMar>
           </w:tcPr>
           <w:p>
-            <w:proofErr w:type="spellStart"/>
             <w:r>
               <w:rPr>
                 <w:color w:val="000000"/>
@@ -826,7 +762,6 @@
               </w:rPr>
               <w:t>Preprocessing</w:t>
             </w:r>
-            <w:proofErr w:type="spellEnd"/>
           </w:p>
         </w:tc>
         <w:tc>
@@ -853,7 +788,7 @@
                 <w:sz w:val="20"/>
                 <w:szCs w:val="20"/>
               </w:rPr>
-              <w:t>src/preprocessing.py</w:t>
+              <w:t>src/data_collection/preprocessor.py</w:t>
             </w:r>
           </w:p>
         </w:tc>
@@ -881,36 +816,8 @@
                 <w:sz w:val="20"/>
                 <w:szCs w:val="20"/>
               </w:rPr>
-              <w:t xml:space="preserve">Nettoyage HTML, </w:t>
-            </w:r>
-            <w:proofErr w:type="spellStart"/>
-            <w:r>
-              <w:rPr>
-                <w:color w:val="000000"/>
-                <w:sz w:val="20"/>
-                <w:szCs w:val="20"/>
-              </w:rPr>
-              <w:t>dédup</w:t>
-            </w:r>
-            <w:proofErr w:type="spellEnd"/>
-            <w:r>
-              <w:rPr>
-                <w:color w:val="000000"/>
-                <w:sz w:val="20"/>
-                <w:szCs w:val="20"/>
-              </w:rPr>
-              <w:t xml:space="preserve">, </w:t>
-            </w:r>
-            <w:proofErr w:type="spellStart"/>
-            <w:r>
-              <w:rPr>
-                <w:color w:val="000000"/>
-                <w:sz w:val="20"/>
-                <w:szCs w:val="20"/>
-              </w:rPr>
-              <w:t>chunking</w:t>
-            </w:r>
-            <w:proofErr w:type="spellEnd"/>
+              <w:t>Nettoyage, construction DataFrame, export CSV</w:t>
+            </w:r>
           </w:p>
         </w:tc>
       </w:tr>
@@ -973,7 +880,7 @@
                 <w:sz w:val="20"/>
                 <w:szCs w:val="20"/>
               </w:rPr>
-              <w:t>src/vectorization.py</w:t>
+              <w:t>src/vectorstore/embeddings.py</w:t>
             </w:r>
           </w:p>
         </w:tc>
@@ -1001,18 +908,8 @@
                 <w:sz w:val="20"/>
                 <w:szCs w:val="20"/>
               </w:rPr>
-              <w:t>Embeddings via mistral-</w:t>
-            </w:r>
-            <w:proofErr w:type="spellStart"/>
-            <w:r>
-              <w:rPr>
-                <w:color w:val="000000"/>
-                <w:sz w:val="20"/>
-                <w:szCs w:val="20"/>
-              </w:rPr>
-              <w:t>embed</w:t>
-            </w:r>
-            <w:proofErr w:type="spellEnd"/>
+              <w:t>Modèle MistralAIEmbeddings (mistral-embed)</w:t>
+            </w:r>
           </w:p>
         </w:tc>
       </w:tr>
@@ -1075,7 +972,7 @@
                 <w:sz w:val="20"/>
                 <w:szCs w:val="20"/>
               </w:rPr>
-              <w:t>src/vector_store.py</w:t>
+              <w:t>src/vectorstore/faiss_store.py</w:t>
             </w:r>
           </w:p>
         </w:tc>
@@ -1167,7 +1064,7 @@
                 <w:sz w:val="20"/>
                 <w:szCs w:val="20"/>
               </w:rPr>
-              <w:t>src/rag_chain.py</w:t>
+              <w:t>src/rag/chain.py</w:t>
             </w:r>
           </w:p>
         </w:tc>
@@ -1195,25 +1092,7 @@
                 <w:sz w:val="20"/>
                 <w:szCs w:val="20"/>
               </w:rPr>
-              <w:t xml:space="preserve">Orchestration </w:t>
-            </w:r>
-            <w:proofErr w:type="spellStart"/>
-            <w:r>
-              <w:rPr>
-                <w:color w:val="000000"/>
-                <w:sz w:val="20"/>
-                <w:szCs w:val="20"/>
-              </w:rPr>
-              <w:t>LangChain</w:t>
-            </w:r>
-            <w:proofErr w:type="spellEnd"/>
-            <w:r>
-              <w:rPr>
-                <w:color w:val="000000"/>
-                <w:sz w:val="20"/>
-                <w:szCs w:val="20"/>
-              </w:rPr>
-              <w:t xml:space="preserve"> + Mistral LLM</w:t>
+              <w:t>Orchestration LangChain + Mistral LLM</w:t>
             </w:r>
           </w:p>
         </w:tc>
@@ -1277,7 +1156,7 @@
                 <w:sz w:val="20"/>
                 <w:szCs w:val="20"/>
               </w:rPr>
-              <w:t>src/chatbot.py</w:t>
+              <w:t>src/rag/chatbot.py</w:t>
             </w:r>
           </w:p>
         </w:tc>
@@ -1305,25 +1184,7 @@
                 <w:sz w:val="20"/>
                 <w:szCs w:val="20"/>
               </w:rPr>
-              <w:t xml:space="preserve">Interface </w:t>
-            </w:r>
-            <w:proofErr w:type="spellStart"/>
-            <w:r>
-              <w:rPr>
-                <w:color w:val="000000"/>
-                <w:sz w:val="20"/>
-                <w:szCs w:val="20"/>
-              </w:rPr>
-              <w:t>Streamlit</w:t>
-            </w:r>
-            <w:proofErr w:type="spellEnd"/>
-            <w:r>
-              <w:rPr>
-                <w:color w:val="000000"/>
-                <w:sz w:val="20"/>
-                <w:szCs w:val="20"/>
-              </w:rPr>
-              <w:t xml:space="preserve"> conversationnelle</w:t>
+              <w:t>Formatage des sources pour Streamlit</w:t>
             </w:r>
           </w:p>
         </w:tc>
@@ -1359,7 +1220,7 @@
                 <w:sz w:val="20"/>
                 <w:szCs w:val="20"/>
               </w:rPr>
-              <w:t>Config</w:t>
+              <w:t>Interface</w:t>
             </w:r>
           </w:p>
         </w:tc>
@@ -1387,7 +1248,7 @@
                 <w:sz w:val="20"/>
                 <w:szCs w:val="20"/>
               </w:rPr>
-              <w:t>src/config.py</w:t>
+              <w:t>app.py</w:t>
             </w:r>
           </w:p>
         </w:tc>
@@ -1415,7 +1276,7 @@
                 <w:sz w:val="20"/>
                 <w:szCs w:val="20"/>
               </w:rPr>
-              <w:t>Clés API, ville, paramètres RAG</w:t>
+              <w:t>Interface Streamlit, historique, cache FAISS</w:t>
             </w:r>
           </w:p>
         </w:tc>
@@ -1439,15 +1300,7 @@
         <w:spacing w:after="160"/>
       </w:pPr>
       <w:r>
-        <w:t>Le pipeline d'indexation est déclenché manuellement via scripts/build_index.py ou au démarrage avec l'option --</w:t>
-      </w:r>
-      <w:proofErr w:type="spellStart"/>
-      <w:r>
-        <w:t>rebuild</w:t>
-      </w:r>
-      <w:proofErr w:type="spellEnd"/>
-      <w:r>
-        <w:t>. Il suit les étapes suivantes :</w:t>
+        <w:t>Le pipeline d’indexation est déclenché manuellement via scripts/build_vectorstore.py. Il suit les étapes suivantes :</w:t>
       </w:r>
     </w:p>
     <w:p>
@@ -1486,15 +1339,7 @@
         <w:spacing w:after="100"/>
       </w:pPr>
       <w:r>
-        <w:t xml:space="preserve">Découpage des descriptions en </w:t>
-      </w:r>
-      <w:proofErr w:type="spellStart"/>
-      <w:r>
-        <w:t>chunks</w:t>
-      </w:r>
-      <w:proofErr w:type="spellEnd"/>
-      <w:r>
-        <w:t xml:space="preserve"> de 400 mots avec un chevauchement de 50 mots pour préserver le contexte aux jointures</w:t>
+        <w:t>Découpage des descriptions en chunks de 512 tokens avec un chevauchement de 64 tokens pour préserver le contexte aux jointures</w:t>
       </w:r>
     </w:p>
     <w:p>
@@ -1507,23 +1352,7 @@
         <w:spacing w:after="100"/>
       </w:pPr>
       <w:r>
-        <w:t>Génération des embeddings via le modèle mistral-</w:t>
-      </w:r>
-      <w:proofErr w:type="spellStart"/>
-      <w:r>
-        <w:t>embed</w:t>
-      </w:r>
-      <w:proofErr w:type="spellEnd"/>
-      <w:r>
-        <w:t xml:space="preserve"> (dimension 1024) par </w:t>
-      </w:r>
-      <w:proofErr w:type="spellStart"/>
-      <w:r>
-        <w:t>batchs</w:t>
-      </w:r>
-      <w:proofErr w:type="spellEnd"/>
-      <w:r>
-        <w:t xml:space="preserve"> de 20 pour respecter les limites API</w:t>
+        <w:t>Génération des embeddings via le modèle mistral-embed (dimension 1024) dans le respect des limites API Mistral</w:t>
       </w:r>
     </w:p>
     <w:p>
@@ -1566,13 +1395,8 @@
         <w:spacing w:after="100"/>
       </w:pPr>
       <w:r>
-        <w:t>Conversion de la question en vecteur via mistral-</w:t>
-      </w:r>
-      <w:proofErr w:type="spellStart"/>
-      <w:r>
-        <w:t>embed</w:t>
-      </w:r>
-      <w:proofErr w:type="spellEnd"/>
+        <w:t>Conversion de la question en vecteur via mistral-embed</w:t>
+      </w:r>
     </w:p>
     <w:p>
       <w:pPr>
@@ -1584,15 +1408,7 @@
         <w:spacing w:after="100"/>
       </w:pPr>
       <w:r>
-        <w:t xml:space="preserve">Recherche des 5 </w:t>
-      </w:r>
-      <w:proofErr w:type="spellStart"/>
-      <w:r>
-        <w:t>chunks</w:t>
-      </w:r>
-      <w:proofErr w:type="spellEnd"/>
-      <w:r>
-        <w:t xml:space="preserve"> les plus proches dans l'index FAISS (distance L2)</w:t>
+        <w:t>Recherche des 5 chunks les plus proches dans l'index FAISS (distance L2)</w:t>
       </w:r>
     </w:p>
     <w:p>
@@ -1618,23 +1434,7 @@
         <w:spacing w:after="100"/>
       </w:pPr>
       <w:r>
-        <w:t>Appel au modèle mistral-</w:t>
-      </w:r>
-      <w:proofErr w:type="spellStart"/>
-      <w:r>
-        <w:t>small</w:t>
-      </w:r>
-      <w:proofErr w:type="spellEnd"/>
-      <w:r>
-        <w:t>-</w:t>
-      </w:r>
-      <w:proofErr w:type="spellStart"/>
-      <w:r>
-        <w:t>latest</w:t>
-      </w:r>
-      <w:proofErr w:type="spellEnd"/>
-      <w:r>
-        <w:t xml:space="preserve"> avec température 0.3 pour des réponses factuelles</w:t>
+        <w:t>Appel au modèle mistral-large-latest avec température 0.1 pour des réponses factuelles et déterministes</w:t>
       </w:r>
     </w:p>
     <w:p>
@@ -1647,13 +1447,8 @@
         <w:spacing w:after="100"/>
       </w:pPr>
       <w:r>
-        <w:t xml:space="preserve">Retour de la réponse à l'interface </w:t>
-      </w:r>
-      <w:proofErr w:type="spellStart"/>
-      <w:r>
-        <w:t>Streamlit</w:t>
-      </w:r>
-      <w:proofErr w:type="spellEnd"/>
+        <w:t>Retour de la réponse à l'interface Streamlit</w:t>
+      </w:r>
     </w:p>
     <w:p>
       <w:pPr>
@@ -1874,18 +1669,8 @@
                 <w:sz w:val="20"/>
                 <w:szCs w:val="20"/>
               </w:rPr>
-              <w:t>mistral-</w:t>
-            </w:r>
-            <w:proofErr w:type="spellStart"/>
-            <w:r>
-              <w:rPr>
-                <w:color w:val="000000"/>
-                <w:sz w:val="20"/>
-                <w:szCs w:val="20"/>
-              </w:rPr>
-              <w:t>embed</w:t>
-            </w:r>
-            <w:proofErr w:type="spellEnd"/>
+              <w:t>mistral-embed</w:t>
+            </w:r>
           </w:p>
         </w:tc>
         <w:tc>
@@ -1976,36 +1761,8 @@
                 <w:sz w:val="20"/>
                 <w:szCs w:val="20"/>
               </w:rPr>
-              <w:t>mistral-</w:t>
-            </w:r>
-            <w:proofErr w:type="spellStart"/>
-            <w:r>
-              <w:rPr>
-                <w:color w:val="000000"/>
-                <w:sz w:val="20"/>
-                <w:szCs w:val="20"/>
-              </w:rPr>
-              <w:t>small</w:t>
-            </w:r>
-            <w:proofErr w:type="spellEnd"/>
-            <w:r>
-              <w:rPr>
-                <w:color w:val="000000"/>
-                <w:sz w:val="20"/>
-                <w:szCs w:val="20"/>
-              </w:rPr>
-              <w:t>-</w:t>
-            </w:r>
-            <w:proofErr w:type="spellStart"/>
-            <w:r>
-              <w:rPr>
-                <w:color w:val="000000"/>
-                <w:sz w:val="20"/>
-                <w:szCs w:val="20"/>
-              </w:rPr>
-              <w:t>latest</w:t>
-            </w:r>
-            <w:proofErr w:type="spellEnd"/>
+              <w:t>mistral-large-latest</w:t>
+            </w:r>
           </w:p>
         </w:tc>
         <w:tc>
@@ -2032,7 +1789,99 @@
                 <w:sz w:val="20"/>
                 <w:szCs w:val="20"/>
               </w:rPr>
-              <w:t>Bon rapport qualité/coût, suffisant pour le POC</w:t>
+              <w:t>Meilleure qualité de raisonnement, réponses cohérentes (temperature=0.1)</w:t>
+            </w:r>
+          </w:p>
+        </w:tc>
+      </w:tr>
+      <w:tr>
+        <w:tblPrEx>
+          <w:tblCellMar>
+            <w:top w:w="0" w:type="dxa"/>
+            <w:bottom w:w="0" w:type="dxa"/>
+          </w:tblCellMar>
+        </w:tblPrEx>
+        <w:tc>
+          <w:tcPr>
+            <w:tcW w:w="2400" w:type="dxa"/>
+            <w:tcBorders>
+              <w:top w:val="single" w:sz="1" w:space="0" w:color="CCCCCC"/>
+              <w:left w:val="single" w:sz="1" w:space="0" w:color="CCCCCC"/>
+              <w:bottom w:val="single" w:sz="1" w:space="0" w:color="CCCCCC"/>
+              <w:right w:val="single" w:sz="1" w:space="0" w:color="CCCCCC"/>
+            </w:tcBorders>
+            <w:shd w:val="clear" w:color="auto" w:fill="FFFFFF"/>
+            <w:tcMar>
+              <w:top w:w="80" w:type="dxa"/>
+              <w:left w:w="120" w:type="dxa"/>
+              <w:bottom w:w="80" w:type="dxa"/>
+              <w:right w:w="120" w:type="dxa"/>
+            </w:tcMar>
+          </w:tcPr>
+          <w:p>
+            <w:r>
+              <w:rPr>
+                <w:color w:val="000000"/>
+                <w:sz w:val="20"/>
+                <w:szCs w:val="20"/>
+              </w:rPr>
+              <w:t>LLM juge</w:t>
+            </w:r>
+          </w:p>
+        </w:tc>
+        <w:tc>
+          <w:tcPr>
+            <w:tcW w:w="3600" w:type="dxa"/>
+            <w:tcBorders>
+              <w:top w:val="single" w:sz="1" w:space="0" w:color="CCCCCC"/>
+              <w:left w:val="single" w:sz="1" w:space="0" w:color="CCCCCC"/>
+              <w:bottom w:val="single" w:sz="1" w:space="0" w:color="CCCCCC"/>
+              <w:right w:val="single" w:sz="1" w:space="0" w:color="CCCCCC"/>
+            </w:tcBorders>
+            <w:shd w:val="clear" w:color="auto" w:fill="FFFFFF"/>
+            <w:tcMar>
+              <w:top w:w="80" w:type="dxa"/>
+              <w:left w:w="120" w:type="dxa"/>
+              <w:bottom w:w="80" w:type="dxa"/>
+              <w:right w:w="120" w:type="dxa"/>
+            </w:tcMar>
+          </w:tcPr>
+          <w:p>
+            <w:r>
+              <w:rPr>
+                <w:color w:val="000000"/>
+                <w:sz w:val="20"/>
+                <w:szCs w:val="20"/>
+              </w:rPr>
+              <w:t>mistral-large-latest</w:t>
+            </w:r>
+          </w:p>
+        </w:tc>
+        <w:tc>
+          <w:tcPr>
+            <w:tcW w:w="3360" w:type="dxa"/>
+            <w:tcBorders>
+              <w:top w:val="single" w:sz="1" w:space="0" w:color="CCCCCC"/>
+              <w:left w:val="single" w:sz="1" w:space="0" w:color="CCCCCC"/>
+              <w:bottom w:val="single" w:sz="1" w:space="0" w:color="CCCCCC"/>
+              <w:right w:val="single" w:sz="1" w:space="0" w:color="CCCCCC"/>
+            </w:tcBorders>
+            <w:shd w:val="clear" w:color="auto" w:fill="FFFFFF"/>
+            <w:tcMar>
+              <w:top w:w="80" w:type="dxa"/>
+              <w:left w:w="120" w:type="dxa"/>
+              <w:bottom w:w="80" w:type="dxa"/>
+              <w:right w:w="120" w:type="dxa"/>
+            </w:tcMar>
+          </w:tcPr>
+          <w:p>
+            <w:r>
+              <w:rPr>
+                <w:color w:val="000000"/>
+                <w:sz w:val="20"/>
+                <w:szCs w:val="20"/>
+              </w:rPr>
+              <w:t>Évaluation automatique LLM-as-a-judge (temperature=0)</w:t>
             </w:r>
           </w:p>
         </w:tc>
@@ -2048,15 +1897,7 @@
         <w:spacing w:after="160"/>
       </w:pPr>
       <w:r>
-        <w:t>Mistral AI présente l'avantage d'être une entreprise française (Paris, 2023), ce qui simplifie les questions de conformité RGPD pour Puls-</w:t>
-      </w:r>
-      <w:proofErr w:type="spellStart"/>
-      <w:r>
-        <w:t>Events</w:t>
-      </w:r>
-      <w:proofErr w:type="spellEnd"/>
-      <w:r>
-        <w:t>. Les modèles sont accessibles via une API REST standard avec une clé API obtenue sur console.mistral.ai.</w:t>
+        <w:t>Mistral AI présente l'avantage d'être une entreprise française (Paris, 2023), ce qui simplifie les questions de conformité RGPD pour Puls-Events. Les modèles sont accessibles via une API REST standard avec une clé API obtenue sur console.mistral.ai.</w:t>
       </w:r>
     </w:p>
     <w:p>
@@ -2072,15 +1913,7 @@
         <w:spacing w:after="160"/>
       </w:pPr>
       <w:r>
-        <w:t xml:space="preserve">FAISS (Facebook AI </w:t>
-      </w:r>
-      <w:proofErr w:type="spellStart"/>
-      <w:r>
-        <w:t>Similarity</w:t>
-      </w:r>
-      <w:proofErr w:type="spellEnd"/>
-      <w:r>
-        <w:t xml:space="preserve"> Search) est une bibliothèque open-source de Meta dédiée à la recherche de similarité dans des espaces vectoriels de grande dimension. Elle a été retenue pour les raisons suivantes :</w:t>
+        <w:t>FAISS (Facebook AI Similarity Search) est une bibliothèque open-source de Meta dédiée à la recherche de similarité dans des espaces vectoriels de grande dimension. Elle a été retenue pour les raisons suivantes :</w:t>
       </w:r>
     </w:p>
     <w:p>
@@ -2119,23 +1952,7 @@
         <w:spacing w:after="100"/>
       </w:pPr>
       <w:r>
-        <w:t xml:space="preserve">Intégration native avec </w:t>
-      </w:r>
-      <w:proofErr w:type="spellStart"/>
-      <w:r>
-        <w:t>LangChain</w:t>
-      </w:r>
-      <w:proofErr w:type="spellEnd"/>
-      <w:r>
-        <w:t xml:space="preserve"> via </w:t>
-      </w:r>
-      <w:proofErr w:type="spellStart"/>
-      <w:r>
-        <w:t>FAISS.from_documents</w:t>
-      </w:r>
-      <w:proofErr w:type="spellEnd"/>
-      <w:r>
-        <w:t>()</w:t>
+        <w:t>Intégration native avec LangChain via FAISS.from_documents()</w:t>
       </w:r>
     </w:p>
     <w:p>
@@ -2164,25 +1981,15 @@
         <w:pStyle w:val="Titre2"/>
       </w:pPr>
       <w:r>
-        <w:t xml:space="preserve">3.3 </w:t>
-      </w:r>
-      <w:proofErr w:type="spellStart"/>
-      <w:r>
-        <w:t>LangChain</w:t>
-      </w:r>
-      <w:proofErr w:type="spellEnd"/>
+        <w:t>3.3 LangChain</w:t>
+      </w:r>
     </w:p>
     <w:p>
       <w:pPr>
         <w:spacing w:after="160"/>
       </w:pPr>
-      <w:proofErr w:type="spellStart"/>
-      <w:r>
-        <w:t>LangChain</w:t>
-      </w:r>
-      <w:proofErr w:type="spellEnd"/>
-      <w:r>
-        <w:t xml:space="preserve"> orchestre les interactions entre les différents composants du pipeline RAG. Il gère notamment :</w:t>
+      <w:r>
+        <w:t>LangChain orchestre les interactions entre les différents composants du pipeline RAG. Il gère notamment :</w:t>
       </w:r>
     </w:p>
     <w:p>
@@ -2195,13 +2002,8 @@
         <w:spacing w:after="100"/>
       </w:pPr>
       <w:r>
-        <w:t xml:space="preserve">La chaîne retriever → prompt → LLM via </w:t>
-      </w:r>
-      <w:proofErr w:type="spellStart"/>
-      <w:r>
-        <w:t>RetrievalQA</w:t>
-      </w:r>
-      <w:proofErr w:type="spellEnd"/>
+        <w:t>La chaîne retriever → prompt → LLM via RetrievalQA</w:t>
+      </w:r>
     </w:p>
     <w:p>
       <w:pPr>
@@ -2213,15 +2015,7 @@
         <w:spacing w:after="100"/>
       </w:pPr>
       <w:r>
-        <w:t xml:space="preserve">La gestion du </w:t>
-      </w:r>
-      <w:proofErr w:type="spellStart"/>
-      <w:r>
-        <w:t>template</w:t>
-      </w:r>
-      <w:proofErr w:type="spellEnd"/>
-      <w:r>
-        <w:t xml:space="preserve"> de prompt et l'injection du contexte</w:t>
+        <w:t>La gestion du template de prompt et l'injection du contexte</w:t>
       </w:r>
     </w:p>
     <w:p>
@@ -2242,25 +2036,15 @@
         <w:pStyle w:val="Titre2"/>
       </w:pPr>
       <w:r>
-        <w:t xml:space="preserve">3.4 </w:t>
-      </w:r>
-      <w:proofErr w:type="spellStart"/>
-      <w:r>
-        <w:t>Streamlit</w:t>
-      </w:r>
-      <w:proofErr w:type="spellEnd"/>
+        <w:t>3.4 Streamlit</w:t>
+      </w:r>
     </w:p>
     <w:p>
       <w:pPr>
         <w:spacing w:after="160"/>
       </w:pPr>
-      <w:proofErr w:type="spellStart"/>
-      <w:r>
-        <w:t>Streamlit</w:t>
-      </w:r>
-      <w:proofErr w:type="spellEnd"/>
-      <w:r>
-        <w:t xml:space="preserve"> a été choisi pour l'interface utilisateur pour sa rapidité de mise en œuvre et sa compatibilité native avec Python. L'interface offre :</w:t>
+      <w:r>
+        <w:t>Streamlit a été choisi pour l'interface utilisateur pour sa rapidité de mise en œuvre et sa compatibilité native avec Python. L'interface offre :</w:t>
       </w:r>
     </w:p>
     <w:p>
@@ -2273,21 +2057,8 @@
         <w:spacing w:after="100"/>
       </w:pPr>
       <w:r>
-        <w:t>Des bulles de conversation (</w:t>
-      </w:r>
-      <w:proofErr w:type="spellStart"/>
-      <w:r>
-        <w:t>st.chat_message</w:t>
-      </w:r>
-      <w:proofErr w:type="spellEnd"/>
-      <w:r>
-        <w:t xml:space="preserve">) reproduisant l'expérience d'un </w:t>
-      </w:r>
-      <w:proofErr w:type="spellStart"/>
-      <w:r>
-        <w:t>chatbot</w:t>
-      </w:r>
-      <w:proofErr w:type="spellEnd"/>
+        <w:t>Des bulles de conversation (st.chat_message) reproduisant l'expérience d'un chatbot</w:t>
+      </w:r>
     </w:p>
     <w:p>
       <w:pPr>
@@ -2299,13 +2070,8 @@
         <w:spacing w:after="100"/>
       </w:pPr>
       <w:r>
-        <w:t xml:space="preserve">Un historique de session via </w:t>
-      </w:r>
-      <w:proofErr w:type="spellStart"/>
-      <w:r>
-        <w:t>st.session_state</w:t>
-      </w:r>
-      <w:proofErr w:type="spellEnd"/>
+        <w:t>Un historique de session via st.session_state</w:t>
+      </w:r>
     </w:p>
     <w:p>
       <w:pPr>
@@ -2318,15 +2084,7 @@
       </w:pPr>
       <w:r>
         <w:lastRenderedPageBreak/>
-        <w:t xml:space="preserve">Un déploiement immédiat sur </w:t>
-      </w:r>
-      <w:proofErr w:type="spellStart"/>
-      <w:r>
-        <w:t>Streamlit</w:t>
-      </w:r>
-      <w:proofErr w:type="spellEnd"/>
-      <w:r>
-        <w:t xml:space="preserve"> Cloud avec gestion sécurisée des secrets API</w:t>
+        <w:t>Un déploiement immédiat sur Streamlit Cloud avec gestion sécurisée des secrets API</w:t>
       </w:r>
     </w:p>
     <w:p>
@@ -2385,15 +2143,7 @@
         <w:spacing w:after="160"/>
       </w:pPr>
       <w:r>
-        <w:t xml:space="preserve">Chaque événement récupéré depuis l'API contient les champs suivants, structurés après </w:t>
-      </w:r>
-      <w:proofErr w:type="spellStart"/>
-      <w:r>
-        <w:t>preprocessing</w:t>
-      </w:r>
-      <w:proofErr w:type="spellEnd"/>
-      <w:r>
-        <w:t xml:space="preserve"> :</w:t>
+        <w:t>Chaque événement récupéré depuis l'API contient les champs suivants, structurés après preprocessing :</w:t>
       </w:r>
     </w:p>
     <w:p>
@@ -2515,7 +2265,6 @@
             </w:tcMar>
           </w:tcPr>
           <w:p>
-            <w:proofErr w:type="spellStart"/>
             <w:r>
               <w:rPr>
                 <w:color w:val="000000"/>
@@ -2524,7 +2273,6 @@
               </w:rPr>
               <w:t>title</w:t>
             </w:r>
-            <w:proofErr w:type="spellEnd"/>
           </w:p>
         </w:tc>
         <w:tc>
@@ -2551,25 +2299,7 @@
                 <w:sz w:val="20"/>
                 <w:szCs w:val="20"/>
               </w:rPr>
-              <w:t>Titre de l'événement (</w:t>
-            </w:r>
-            <w:proofErr w:type="spellStart"/>
-            <w:r>
-              <w:rPr>
-                <w:color w:val="000000"/>
-                <w:sz w:val="20"/>
-                <w:szCs w:val="20"/>
-              </w:rPr>
-              <w:t>fr</w:t>
-            </w:r>
-            <w:proofErr w:type="spellEnd"/>
-            <w:r>
-              <w:rPr>
-                <w:color w:val="000000"/>
-                <w:sz w:val="20"/>
-                <w:szCs w:val="20"/>
-              </w:rPr>
-              <w:t>)</w:t>
+              <w:t>Titre de l'événement (fr)</w:t>
             </w:r>
           </w:p>
         </w:tc>
@@ -2633,18 +2363,8 @@
                 <w:sz w:val="20"/>
                 <w:szCs w:val="20"/>
               </w:rPr>
-              <w:t xml:space="preserve">Description longue nettoyée et </w:t>
-            </w:r>
-            <w:proofErr w:type="spellStart"/>
-            <w:r>
-              <w:rPr>
-                <w:color w:val="000000"/>
-                <w:sz w:val="20"/>
-                <w:szCs w:val="20"/>
-              </w:rPr>
-              <w:t>chunked</w:t>
-            </w:r>
-            <w:proofErr w:type="spellEnd"/>
+              <w:t>Description longue nettoyée et chunked</w:t>
+            </w:r>
           </w:p>
         </w:tc>
       </w:tr>
@@ -2737,7 +2457,6 @@
             </w:tcMar>
           </w:tcPr>
           <w:p>
-            <w:proofErr w:type="spellStart"/>
             <w:r>
               <w:rPr>
                 <w:color w:val="000000"/>
@@ -2746,7 +2465,6 @@
               </w:rPr>
               <w:t>address</w:t>
             </w:r>
-            <w:proofErr w:type="spellEnd"/>
           </w:p>
         </w:tc>
         <w:tc>
@@ -2803,7 +2521,6 @@
             </w:tcMar>
           </w:tcPr>
           <w:p>
-            <w:proofErr w:type="spellStart"/>
             <w:r>
               <w:rPr>
                 <w:color w:val="000000"/>
@@ -2812,7 +2529,6 @@
               </w:rPr>
               <w:t>date_debut</w:t>
             </w:r>
-            <w:proofErr w:type="spellEnd"/>
           </w:p>
         </w:tc>
         <w:tc>
@@ -2869,7 +2585,6 @@
             </w:tcMar>
           </w:tcPr>
           <w:p>
-            <w:proofErr w:type="spellStart"/>
             <w:r>
               <w:rPr>
                 <w:color w:val="000000"/>
@@ -2878,7 +2593,6 @@
               </w:rPr>
               <w:t>date_fin</w:t>
             </w:r>
-            <w:proofErr w:type="spellEnd"/>
           </w:p>
         </w:tc>
         <w:tc>
@@ -2935,7 +2649,6 @@
             </w:tcMar>
           </w:tcPr>
           <w:p>
-            <w:proofErr w:type="spellStart"/>
             <w:r>
               <w:rPr>
                 <w:color w:val="000000"/>
@@ -2944,7 +2657,6 @@
               </w:rPr>
               <w:t>chunk_id</w:t>
             </w:r>
-            <w:proofErr w:type="spellEnd"/>
           </w:p>
         </w:tc>
         <w:tc>
@@ -2971,43 +2683,7 @@
                 <w:sz w:val="20"/>
                 <w:szCs w:val="20"/>
               </w:rPr>
-              <w:t xml:space="preserve">Identifiant unique du </w:t>
-            </w:r>
-            <w:proofErr w:type="spellStart"/>
-            <w:r>
-              <w:rPr>
-                <w:color w:val="000000"/>
-                <w:sz w:val="20"/>
-                <w:szCs w:val="20"/>
-              </w:rPr>
-              <w:t>chunk</w:t>
-            </w:r>
-            <w:proofErr w:type="spellEnd"/>
-            <w:r>
-              <w:rPr>
-                <w:color w:val="000000"/>
-                <w:sz w:val="20"/>
-                <w:szCs w:val="20"/>
-              </w:rPr>
-              <w:t xml:space="preserve"> (</w:t>
-            </w:r>
-            <w:proofErr w:type="spellStart"/>
-            <w:r>
-              <w:rPr>
-                <w:color w:val="000000"/>
-                <w:sz w:val="20"/>
-                <w:szCs w:val="20"/>
-              </w:rPr>
-              <w:t>event_id</w:t>
-            </w:r>
-            <w:proofErr w:type="spellEnd"/>
-            <w:r>
-              <w:rPr>
-                <w:color w:val="000000"/>
-                <w:sz w:val="20"/>
-                <w:szCs w:val="20"/>
-              </w:rPr>
-              <w:t xml:space="preserve"> + index)</w:t>
+              <w:t>Identifiant unique du chunk (event_id + index)</w:t>
             </w:r>
           </w:p>
         </w:tc>
@@ -3023,28 +2699,15 @@
         <w:pStyle w:val="Titre2"/>
       </w:pPr>
       <w:r>
-        <w:t xml:space="preserve">4.3 Stratégie de </w:t>
-      </w:r>
-      <w:proofErr w:type="spellStart"/>
-      <w:r>
-        <w:t>chunking</w:t>
-      </w:r>
-      <w:proofErr w:type="spellEnd"/>
+        <w:t>4.3 Stratégie de chunking</w:t>
+      </w:r>
     </w:p>
     <w:p>
       <w:pPr>
         <w:spacing w:after="160"/>
       </w:pPr>
       <w:r>
-        <w:t xml:space="preserve">Les descriptions d'événements peuvent être longues et dépasser la fenêtre contextuelle du modèle d'embedding. La stratégie retenue est un </w:t>
-      </w:r>
-      <w:proofErr w:type="spellStart"/>
-      <w:r>
-        <w:t>chunking</w:t>
-      </w:r>
-      <w:proofErr w:type="spellEnd"/>
-      <w:r>
-        <w:t xml:space="preserve"> par mots avec chevauchement :</w:t>
+        <w:t>Les descriptions d'événements peuvent être longues et dépasser la fenêtre contextuelle du modèle d'embedding. La stratégie retenue est un chunking par mots avec chevauchement :</w:t>
       </w:r>
     </w:p>
     <w:p>
@@ -3057,15 +2720,7 @@
         <w:spacing w:after="100"/>
       </w:pPr>
       <w:r>
-        <w:t xml:space="preserve">Taille de </w:t>
-      </w:r>
-      <w:proofErr w:type="spellStart"/>
-      <w:r>
-        <w:t>chunk</w:t>
-      </w:r>
-      <w:proofErr w:type="spellEnd"/>
-      <w:r>
-        <w:t xml:space="preserve"> : 400 mots — équilibre entre granularité sémantique et exhaustivité</w:t>
+        <w:t>Taille de chunk : 512 tokens — équilibre entre granularité sémantique et exhaustivité</w:t>
       </w:r>
     </w:p>
     <w:p>
@@ -3078,13 +2733,8 @@
         <w:spacing w:after="100"/>
       </w:pPr>
       <w:r>
-        <w:t xml:space="preserve">Chevauchement : 50 mots — évite la perte de contexte aux jointures entre </w:t>
-      </w:r>
-      <w:proofErr w:type="spellStart"/>
-      <w:r>
-        <w:t>chunks</w:t>
-      </w:r>
-      <w:proofErr w:type="spellEnd"/>
+        <w:t>Chevauchement : 64 tokens — évite la perte de contexte aux jointures entre chunks</w:t>
+      </w:r>
     </w:p>
     <w:p>
       <w:pPr>
@@ -3096,15 +2746,7 @@
         <w:spacing w:after="100"/>
       </w:pPr>
       <w:r>
-        <w:t xml:space="preserve">Chaque </w:t>
-      </w:r>
-      <w:proofErr w:type="spellStart"/>
-      <w:r>
-        <w:t>chunk</w:t>
-      </w:r>
-      <w:proofErr w:type="spellEnd"/>
-      <w:r>
-        <w:t xml:space="preserve"> conserve les métadonnées de l'événement parent (titre, lieu, dates)</w:t>
+        <w:t>Chaque chunk conserve les métadonnées de l'événement parent (titre, lieu, dates)</w:t>
       </w:r>
     </w:p>
     <w:p>
@@ -3139,15 +2781,7 @@
         <w:spacing w:after="160"/>
       </w:pPr>
       <w:r>
-        <w:t>L'évaluation du système RAG repose sur un jeu de données annoté manuellement (tests/</w:t>
-      </w:r>
-      <w:proofErr w:type="spellStart"/>
-      <w:r>
-        <w:t>eval_dataset.json</w:t>
-      </w:r>
-      <w:proofErr w:type="spellEnd"/>
-      <w:r>
-        <w:t>), constitué de 15 à 20 questions représentatives des cas d'usage réels, accompagnées de leurs réponses de référence.</w:t>
+        <w:t>L’évaluation du système RAG repose sur un jeu de données généré automatiquement (data/processed/qa_dataset.json), constitué de 20 paires question/réponse produites par Mistral à partir d’événements réels de l’index. La génération est orchestrée par src/evaluation/dataset_generator.py.</w:t>
       </w:r>
     </w:p>
     <w:p>
@@ -3155,15 +2789,7 @@
         <w:spacing w:after="160"/>
       </w:pPr>
       <w:r>
-        <w:t>La qualité des réponses est mesurée par similarité sémantique entre la réponse du RAG et la réponse annotée, en utilisant le modèle paraphrase-multilingual-MiniLM-L12-v2 de la bibliothèque sentence-</w:t>
-      </w:r>
-      <w:proofErr w:type="spellStart"/>
-      <w:r>
-        <w:t>transformers</w:t>
-      </w:r>
-      <w:proofErr w:type="spellEnd"/>
-      <w:r>
-        <w:t>.</w:t>
+        <w:t>La qualité des réponses est mesurée par la technique LLM-as-a-judge : le modèle mistral-large-latest (temperature=0) compare la réponse du RAG à la réponse attendue et répond OUI ou NON selon qu’elles ont le même sens. Cette approche évite toute dépendance à des modèles d’embeddings locaux et reste cohérente avec le reste de la stack Mistral. L’évaluation est orchestrée par src/evaluation/evaluator.py.</w:t>
       </w:r>
     </w:p>
     <w:p>
@@ -3330,7 +2956,7 @@
                 <w:sz w:val="20"/>
                 <w:szCs w:val="20"/>
               </w:rPr>
-              <w:t>&gt; 0.7</w:t>
+              <w:t>OUI (score &gt; 70 %)</w:t>
             </w:r>
           </w:p>
         </w:tc>
@@ -3358,7 +2984,7 @@
                 <w:sz w:val="20"/>
                 <w:szCs w:val="20"/>
               </w:rPr>
-              <w:t>Excellente réponse</w:t>
+              <w:t>Réponse juge conforme (même sens et informations)</w:t>
             </w:r>
           </w:p>
         </w:tc>
@@ -3422,7 +3048,7 @@
                 <w:sz w:val="20"/>
                 <w:szCs w:val="20"/>
               </w:rPr>
-              <w:t>0.5 → 0.7</w:t>
+              <w:t>NON (score &lt; 70 %)</w:t>
             </w:r>
           </w:p>
         </w:tc>
@@ -3450,7 +3076,7 @@
                 <w:sz w:val="20"/>
                 <w:szCs w:val="20"/>
               </w:rPr>
-              <w:t>Bonne réponse</w:t>
+              <w:t>Réponse juge non conforme</w:t>
             </w:r>
           </w:p>
         </w:tc>
@@ -3514,7 +3140,7 @@
                 <w:sz w:val="20"/>
                 <w:szCs w:val="20"/>
               </w:rPr>
-              <w:t>0.3 → 0.5</w:t>
+              <w:t>Taux OUI</w:t>
             </w:r>
           </w:p>
         </w:tc>
@@ -3542,7 +3168,7 @@
                 <w:sz w:val="20"/>
                 <w:szCs w:val="20"/>
               </w:rPr>
-              <w:t>Réponse partielle</w:t>
+              <w:t>Score global = nb_OUI / nb_total</w:t>
             </w:r>
           </w:p>
         </w:tc>
@@ -3606,7 +3232,7 @@
                 <w:sz w:val="20"/>
                 <w:szCs w:val="20"/>
               </w:rPr>
-              <w:t>&lt; 0.3</w:t>
+              <w:t>Seuil cible</w:t>
             </w:r>
           </w:p>
         </w:tc>
@@ -3634,7 +3260,7 @@
                 <w:sz w:val="20"/>
                 <w:szCs w:val="20"/>
               </w:rPr>
-              <w:t>Réponse hors sujet</w:t>
+              <w:t>Taux OUI &gt;= 70 % = POC validé</w:t>
             </w:r>
           </w:p>
         </w:tc>
@@ -3662,18 +3288,8 @@
                 <w:sz w:val="20"/>
                 <w:szCs w:val="20"/>
               </w:rPr>
-              <w:t xml:space="preserve">Réviser le </w:t>
-            </w:r>
-            <w:proofErr w:type="spellStart"/>
-            <w:r>
-              <w:rPr>
-                <w:color w:val="000000"/>
-                <w:sz w:val="20"/>
-                <w:szCs w:val="20"/>
-              </w:rPr>
-              <w:t>chunking</w:t>
-            </w:r>
-            <w:proofErr w:type="spellEnd"/>
+              <w:t>Réviser le chunking</w:t>
+            </w:r>
           </w:p>
         </w:tc>
       </w:tr>
@@ -3696,15 +3312,7 @@
         <w:spacing w:after="160"/>
       </w:pPr>
       <w:r>
-        <w:t xml:space="preserve">En complément de l'évaluation sémantique, 4 fichiers de tests </w:t>
-      </w:r>
-      <w:proofErr w:type="spellStart"/>
-      <w:r>
-        <w:t>pytest</w:t>
-      </w:r>
-      <w:proofErr w:type="spellEnd"/>
-      <w:r>
-        <w:t xml:space="preserve"> couvrent les couches techniques du système :</w:t>
+        <w:t>En complément de l'évaluation sémantique, 4 fichiers de tests pytest couvrent les couches techniques du système :</w:t>
       </w:r>
     </w:p>
     <w:p>
@@ -3730,13 +3338,8 @@
         <w:spacing w:after="100"/>
       </w:pPr>
       <w:r>
-        <w:t xml:space="preserve">test_preprocessing.py — vérifie le nettoyage HTML, la déduplication et la cohérence du </w:t>
-      </w:r>
-      <w:proofErr w:type="spellStart"/>
-      <w:r>
-        <w:t>chunking</w:t>
-      </w:r>
-      <w:proofErr w:type="spellEnd"/>
+        <w:t>test_preprocessing.py — vérifie le nettoyage HTML, la déduplication et la cohérence du chunking</w:t>
+      </w:r>
     </w:p>
     <w:p>
       <w:pPr>
@@ -3855,243 +3458,69 @@
                 <w:sz w:val="20"/>
                 <w:szCs w:val="20"/>
               </w:rPr>
-              <w:t xml:space="preserve">git clone &lt;repo&gt; &amp;&amp; cd </w:t>
-            </w:r>
-            <w:proofErr w:type="spellStart"/>
+              <w:t>git clone &lt;repo&gt; &amp;&amp; cd puls-events-rag</w:t>
+            </w:r>
+          </w:p>
+          <w:p>
             <w:r>
               <w:rPr>
                 <w:rFonts w:ascii="Courier New" w:eastAsia="Courier New" w:hAnsi="Courier New" w:cs="Courier New"/>
                 <w:sz w:val="20"/>
                 <w:szCs w:val="20"/>
               </w:rPr>
-              <w:t>puls</w:t>
-            </w:r>
-            <w:proofErr w:type="spellEnd"/>
+              <w:t>python -m venv .venv &amp;&amp; source .venv/bin/activate</w:t>
+            </w:r>
+          </w:p>
+          <w:p>
             <w:r>
               <w:rPr>
                 <w:rFonts w:ascii="Courier New" w:eastAsia="Courier New" w:hAnsi="Courier New" w:cs="Courier New"/>
                 <w:sz w:val="20"/>
                 <w:szCs w:val="20"/>
               </w:rPr>
-              <w:t>-</w:t>
-            </w:r>
-            <w:proofErr w:type="spellStart"/>
+              <w:t>pip install -r requirements.txt</w:t>
+            </w:r>
+          </w:p>
+          <w:p>
             <w:r>
               <w:rPr>
                 <w:rFonts w:ascii="Courier New" w:eastAsia="Courier New" w:hAnsi="Courier New" w:cs="Courier New"/>
                 <w:sz w:val="20"/>
                 <w:szCs w:val="20"/>
               </w:rPr>
-              <w:t>events</w:t>
-            </w:r>
-            <w:proofErr w:type="spellEnd"/>
+              <w:t>cp .env.example .env  # renseigner les clés API</w:t>
+            </w:r>
+          </w:p>
+          <w:p>
+            <w:pPr>
+              <w:rPr>
+                <w:lang w:val="en-US"/>
+              </w:rPr>
+            </w:pPr>
             <w:r>
               <w:rPr>
                 <w:rFonts w:ascii="Courier New" w:eastAsia="Courier New" w:hAnsi="Courier New" w:cs="Courier New"/>
                 <w:sz w:val="20"/>
                 <w:szCs w:val="20"/>
-              </w:rPr>
-              <w:t>-rag</w:t>
-            </w:r>
-          </w:p>
-          <w:p>
+                <w:lang w:val="en-US"/>
+              </w:rPr>
+              <w:t>python scripts/build_vectorstore.py</w:t>
+            </w:r>
+          </w:p>
+          <w:p>
+            <w:pPr>
+              <w:rPr>
+                <w:lang w:val="en-US"/>
+              </w:rPr>
+            </w:pPr>
             <w:r>
               <w:rPr>
                 <w:rFonts w:ascii="Courier New" w:eastAsia="Courier New" w:hAnsi="Courier New" w:cs="Courier New"/>
                 <w:sz w:val="20"/>
                 <w:szCs w:val="20"/>
-              </w:rPr>
-              <w:t xml:space="preserve">python -m </w:t>
-            </w:r>
-            <w:proofErr w:type="spellStart"/>
-            <w:r>
-              <w:rPr>
-                <w:rFonts w:ascii="Courier New" w:eastAsia="Courier New" w:hAnsi="Courier New" w:cs="Courier New"/>
-                <w:sz w:val="20"/>
-                <w:szCs w:val="20"/>
-              </w:rPr>
-              <w:t>venv</w:t>
-            </w:r>
-            <w:proofErr w:type="spellEnd"/>
-            <w:r>
-              <w:rPr>
-                <w:rFonts w:ascii="Courier New" w:eastAsia="Courier New" w:hAnsi="Courier New" w:cs="Courier New"/>
-                <w:sz w:val="20"/>
-                <w:szCs w:val="20"/>
-              </w:rPr>
-              <w:t xml:space="preserve"> .</w:t>
-            </w:r>
-            <w:proofErr w:type="spellStart"/>
-            <w:r>
-              <w:rPr>
-                <w:rFonts w:ascii="Courier New" w:eastAsia="Courier New" w:hAnsi="Courier New" w:cs="Courier New"/>
-                <w:sz w:val="20"/>
-                <w:szCs w:val="20"/>
-              </w:rPr>
-              <w:t>venv</w:t>
-            </w:r>
-            <w:proofErr w:type="spellEnd"/>
-            <w:r>
-              <w:rPr>
-                <w:rFonts w:ascii="Courier New" w:eastAsia="Courier New" w:hAnsi="Courier New" w:cs="Courier New"/>
-                <w:sz w:val="20"/>
-                <w:szCs w:val="20"/>
-              </w:rPr>
-              <w:t xml:space="preserve"> &amp;&amp; source .</w:t>
-            </w:r>
-            <w:proofErr w:type="spellStart"/>
-            <w:r>
-              <w:rPr>
-                <w:rFonts w:ascii="Courier New" w:eastAsia="Courier New" w:hAnsi="Courier New" w:cs="Courier New"/>
-                <w:sz w:val="20"/>
-                <w:szCs w:val="20"/>
-              </w:rPr>
-              <w:t>venv</w:t>
-            </w:r>
-            <w:proofErr w:type="spellEnd"/>
-            <w:r>
-              <w:rPr>
-                <w:rFonts w:ascii="Courier New" w:eastAsia="Courier New" w:hAnsi="Courier New" w:cs="Courier New"/>
-                <w:sz w:val="20"/>
-                <w:szCs w:val="20"/>
-              </w:rPr>
-              <w:t>/bin/</w:t>
-            </w:r>
-            <w:proofErr w:type="spellStart"/>
-            <w:r>
-              <w:rPr>
-                <w:rFonts w:ascii="Courier New" w:eastAsia="Courier New" w:hAnsi="Courier New" w:cs="Courier New"/>
-                <w:sz w:val="20"/>
-                <w:szCs w:val="20"/>
-              </w:rPr>
-              <w:t>activate</w:t>
-            </w:r>
-            <w:proofErr w:type="spellEnd"/>
-          </w:p>
-          <w:p>
-            <w:proofErr w:type="spellStart"/>
-            <w:r>
-              <w:rPr>
-                <w:rFonts w:ascii="Courier New" w:eastAsia="Courier New" w:hAnsi="Courier New" w:cs="Courier New"/>
-                <w:sz w:val="20"/>
-                <w:szCs w:val="20"/>
-              </w:rPr>
-              <w:t>pip</w:t>
-            </w:r>
-            <w:proofErr w:type="spellEnd"/>
-            <w:r>
-              <w:rPr>
-                <w:rFonts w:ascii="Courier New" w:eastAsia="Courier New" w:hAnsi="Courier New" w:cs="Courier New"/>
-                <w:sz w:val="20"/>
-                <w:szCs w:val="20"/>
-              </w:rPr>
-              <w:t xml:space="preserve"> </w:t>
-            </w:r>
-            <w:proofErr w:type="spellStart"/>
-            <w:r>
-              <w:rPr>
-                <w:rFonts w:ascii="Courier New" w:eastAsia="Courier New" w:hAnsi="Courier New" w:cs="Courier New"/>
-                <w:sz w:val="20"/>
-                <w:szCs w:val="20"/>
-              </w:rPr>
-              <w:t>install</w:t>
-            </w:r>
-            <w:proofErr w:type="spellEnd"/>
-            <w:r>
-              <w:rPr>
-                <w:rFonts w:ascii="Courier New" w:eastAsia="Courier New" w:hAnsi="Courier New" w:cs="Courier New"/>
-                <w:sz w:val="20"/>
-                <w:szCs w:val="20"/>
-              </w:rPr>
-              <w:t xml:space="preserve"> -r requirements.txt</w:t>
-            </w:r>
-          </w:p>
-          <w:p>
-            <w:proofErr w:type="spellStart"/>
-            <w:r>
-              <w:rPr>
-                <w:rFonts w:ascii="Courier New" w:eastAsia="Courier New" w:hAnsi="Courier New" w:cs="Courier New"/>
-                <w:sz w:val="20"/>
-                <w:szCs w:val="20"/>
-              </w:rPr>
-              <w:t>cp</w:t>
-            </w:r>
-            <w:proofErr w:type="spellEnd"/>
-            <w:r>
-              <w:rPr>
-                <w:rFonts w:ascii="Courier New" w:eastAsia="Courier New" w:hAnsi="Courier New" w:cs="Courier New"/>
-                <w:sz w:val="20"/>
-                <w:szCs w:val="20"/>
-              </w:rPr>
-              <w:t xml:space="preserve"> .</w:t>
-            </w:r>
-            <w:proofErr w:type="spellStart"/>
-            <w:r>
-              <w:rPr>
-                <w:rFonts w:ascii="Courier New" w:eastAsia="Courier New" w:hAnsi="Courier New" w:cs="Courier New"/>
-                <w:sz w:val="20"/>
-                <w:szCs w:val="20"/>
-              </w:rPr>
-              <w:t>env.example</w:t>
-            </w:r>
-            <w:proofErr w:type="spellEnd"/>
-            <w:r>
-              <w:rPr>
-                <w:rFonts w:ascii="Courier New" w:eastAsia="Courier New" w:hAnsi="Courier New" w:cs="Courier New"/>
-                <w:sz w:val="20"/>
-                <w:szCs w:val="20"/>
-              </w:rPr>
-              <w:t xml:space="preserve"> .</w:t>
-            </w:r>
-            <w:proofErr w:type="spellStart"/>
-            <w:r>
-              <w:rPr>
-                <w:rFonts w:ascii="Courier New" w:eastAsia="Courier New" w:hAnsi="Courier New" w:cs="Courier New"/>
-                <w:sz w:val="20"/>
-                <w:szCs w:val="20"/>
-              </w:rPr>
-              <w:t>env</w:t>
-            </w:r>
-            <w:proofErr w:type="spellEnd"/>
-            <w:r>
-              <w:rPr>
-                <w:rFonts w:ascii="Courier New" w:eastAsia="Courier New" w:hAnsi="Courier New" w:cs="Courier New"/>
-                <w:sz w:val="20"/>
-                <w:szCs w:val="20"/>
-              </w:rPr>
-              <w:t xml:space="preserve">  # renseigner les clés API</w:t>
-            </w:r>
-          </w:p>
-          <w:p>
-            <w:pPr>
-              <w:rPr>
                 <w:lang w:val="en-US"/>
               </w:rPr>
-            </w:pPr>
-            <w:r>
-              <w:rPr>
-                <w:rFonts w:ascii="Courier New" w:eastAsia="Courier New" w:hAnsi="Courier New" w:cs="Courier New"/>
-                <w:sz w:val="20"/>
-                <w:szCs w:val="20"/>
-                <w:lang w:val="en-US"/>
-              </w:rPr>
-              <w:t>python scripts/build_index.py</w:t>
-            </w:r>
-          </w:p>
-          <w:p>
-            <w:pPr>
-              <w:rPr>
-                <w:lang w:val="en-US"/>
-              </w:rPr>
-            </w:pPr>
-            <w:r>
-              <w:rPr>
-                <w:rFonts w:ascii="Courier New" w:eastAsia="Courier New" w:hAnsi="Courier New" w:cs="Courier New"/>
-                <w:sz w:val="20"/>
-                <w:szCs w:val="20"/>
-                <w:lang w:val="en-US"/>
-              </w:rPr>
-              <w:t>streamlit run streamlit/app.py</w:t>
+              <w:t>streamlit run app.py</w:t>
             </w:r>
           </w:p>
         </w:tc>
@@ -4110,15 +3539,7 @@
         <w:pStyle w:val="Titre2"/>
       </w:pPr>
       <w:r>
-        <w:t xml:space="preserve">6.2 Déploiement </w:t>
-      </w:r>
-      <w:proofErr w:type="spellStart"/>
-      <w:r>
-        <w:t>Streamlit</w:t>
-      </w:r>
-      <w:proofErr w:type="spellEnd"/>
-      <w:r>
-        <w:t xml:space="preserve"> Cloud</w:t>
+        <w:t>6.2 Déploiement Streamlit Cloud</w:t>
       </w:r>
     </w:p>
     <w:p>
@@ -4139,15 +3560,7 @@
         <w:spacing w:after="100"/>
       </w:pPr>
       <w:r>
-        <w:t>Push du projet sur GitHub (sans .</w:t>
-      </w:r>
-      <w:proofErr w:type="spellStart"/>
-      <w:r>
-        <w:t>env</w:t>
-      </w:r>
-      <w:proofErr w:type="spellEnd"/>
-      <w:r>
-        <w:t xml:space="preserve"> ni data/)</w:t>
+        <w:t>Push du projet sur GitHub (sans .env ni data/)</w:t>
       </w:r>
     </w:p>
     <w:p>
@@ -4173,15 +3586,7 @@
         <w:spacing w:after="100"/>
       </w:pPr>
       <w:r>
-        <w:t xml:space="preserve">Renseignement des clés API dans la section Secrets de </w:t>
-      </w:r>
-      <w:proofErr w:type="spellStart"/>
-      <w:r>
-        <w:t>Streamlit</w:t>
-      </w:r>
-      <w:proofErr w:type="spellEnd"/>
-      <w:r>
-        <w:t xml:space="preserve"> Cloud</w:t>
+        <w:t>Renseignement des clés API dans la section Secrets de Streamlit Cloud</w:t>
       </w:r>
     </w:p>
     <w:p>
@@ -4194,15 +3599,7 @@
         <w:spacing w:after="100"/>
       </w:pPr>
       <w:r>
-        <w:t xml:space="preserve">L'URL publique générée (ex. </w:t>
-      </w:r>
-      <w:proofErr w:type="spellStart"/>
-      <w:r>
-        <w:t>puls-events.streamlit.app</w:t>
-      </w:r>
-      <w:proofErr w:type="spellEnd"/>
-      <w:r>
-        <w:t>) est accessible depuis n'importe quel navigateur</w:t>
+        <w:t>L'URL publique générée (ex. puls-events.streamlit.app) est accessible depuis n'importe quel navigateur</w:t>
       </w:r>
     </w:p>
     <w:p>
@@ -4338,7 +3735,7 @@
                 <w:sz w:val="20"/>
                 <w:szCs w:val="20"/>
               </w:rPr>
-              <w:t>OPENAGENDA_API_KEY</w:t>
+              <w:t>OPEN_AGENDA_API_KEY</w:t>
             </w:r>
           </w:p>
         </w:tc>
@@ -4435,6 +3832,134 @@
           </w:p>
         </w:tc>
       </w:tr>
+      <w:tr>
+        <w:tblPrEx>
+          <w:tblCellMar>
+            <w:top w:w="0" w:type="dxa"/>
+            <w:bottom w:w="0" w:type="dxa"/>
+          </w:tblCellMar>
+        </w:tblPrEx>
+        <w:tc>
+          <w:tcPr>
+            <w:tcW w:w="3600" w:type="dxa"/>
+            <w:tcBorders>
+              <w:top w:val="single" w:sz="1" w:space="0" w:color="CCCCCC"/>
+              <w:left w:val="single" w:sz="1" w:space="0" w:color="CCCCCC"/>
+              <w:bottom w:val="single" w:sz="1" w:space="0" w:color="CCCCCC"/>
+              <w:right w:val="single" w:sz="1" w:space="0" w:color="CCCCCC"/>
+            </w:tcBorders>
+            <w:shd w:val="clear" w:color="auto" w:fill="FFFFFF"/>
+            <w:tcMar>
+              <w:top w:w="80" w:type="dxa"/>
+              <w:left w:w="120" w:type="dxa"/>
+              <w:bottom w:w="80" w:type="dxa"/>
+              <w:right w:w="120" w:type="dxa"/>
+            </w:tcMar>
+          </w:tcPr>
+          <w:p>
+            <w:r>
+              <w:rPr>
+                <w:color w:val="000000"/>
+                <w:sz w:val="20"/>
+                <w:szCs w:val="20"/>
+              </w:rPr>
+              <w:t>TARGET_CITY</w:t>
+            </w:r>
+          </w:p>
+        </w:tc>
+        <w:tc>
+          <w:tcPr>
+            <w:tcW w:w="5760" w:type="dxa"/>
+            <w:tcBorders>
+              <w:top w:val="single" w:sz="1" w:space="0" w:color="CCCCCC"/>
+              <w:left w:val="single" w:sz="1" w:space="0" w:color="CCCCCC"/>
+              <w:bottom w:val="single" w:sz="1" w:space="0" w:color="CCCCCC"/>
+              <w:right w:val="single" w:sz="1" w:space="0" w:color="CCCCCC"/>
+            </w:tcBorders>
+            <w:shd w:val="clear" w:color="auto" w:fill="FFFFFF"/>
+            <w:tcMar>
+              <w:top w:w="80" w:type="dxa"/>
+              <w:left w:w="120" w:type="dxa"/>
+              <w:bottom w:w="80" w:type="dxa"/>
+              <w:right w:w="120" w:type="dxa"/>
+            </w:tcMar>
+          </w:tcPr>
+          <w:p>
+            <w:r>
+              <w:rPr>
+                <w:color w:val="000000"/>
+                <w:sz w:val="20"/>
+                <w:szCs w:val="20"/>
+              </w:rPr>
+              <w:t>Ville cible pour le filtrage géographique des événements (ex : Rennes)</w:t>
+            </w:r>
+          </w:p>
+        </w:tc>
+      </w:tr>
+      <w:tr>
+        <w:tblPrEx>
+          <w:tblCellMar>
+            <w:top w:w="0" w:type="dxa"/>
+            <w:bottom w:w="0" w:type="dxa"/>
+          </w:tblCellMar>
+        </w:tblPrEx>
+        <w:tc>
+          <w:tcPr>
+            <w:tcW w:w="3600" w:type="dxa"/>
+            <w:tcBorders>
+              <w:top w:val="single" w:sz="1" w:space="0" w:color="CCCCCC"/>
+              <w:left w:val="single" w:sz="1" w:space="0" w:color="CCCCCC"/>
+              <w:bottom w:val="single" w:sz="1" w:space="0" w:color="CCCCCC"/>
+              <w:right w:val="single" w:sz="1" w:space="0" w:color="CCCCCC"/>
+            </w:tcBorders>
+            <w:shd w:val="clear" w:color="auto" w:fill="FFFFFF"/>
+            <w:tcMar>
+              <w:top w:w="80" w:type="dxa"/>
+              <w:left w:w="120" w:type="dxa"/>
+              <w:bottom w:w="80" w:type="dxa"/>
+              <w:right w:w="120" w:type="dxa"/>
+            </w:tcMar>
+          </w:tcPr>
+          <w:p>
+            <w:r>
+              <w:rPr>
+                <w:color w:val="000000"/>
+                <w:sz w:val="20"/>
+                <w:szCs w:val="20"/>
+              </w:rPr>
+              <w:t>TARGET_REGION</w:t>
+            </w:r>
+          </w:p>
+        </w:tc>
+        <w:tc>
+          <w:tcPr>
+            <w:tcW w:w="5760" w:type="dxa"/>
+            <w:tcBorders>
+              <w:top w:val="single" w:sz="1" w:space="0" w:color="CCCCCC"/>
+              <w:left w:val="single" w:sz="1" w:space="0" w:color="CCCCCC"/>
+              <w:bottom w:val="single" w:sz="1" w:space="0" w:color="CCCCCC"/>
+              <w:right w:val="single" w:sz="1" w:space="0" w:color="CCCCCC"/>
+            </w:tcBorders>
+            <w:shd w:val="clear" w:color="auto" w:fill="FFFFFF"/>
+            <w:tcMar>
+              <w:top w:w="80" w:type="dxa"/>
+              <w:left w:w="120" w:type="dxa"/>
+              <w:bottom w:w="80" w:type="dxa"/>
+              <w:right w:w="120" w:type="dxa"/>
+            </w:tcMar>
+          </w:tcPr>
+          <w:p>
+            <w:r>
+              <w:rPr>
+                <w:color w:val="000000"/>
+                <w:sz w:val="20"/>
+                <w:szCs w:val="20"/>
+              </w:rPr>
+              <w:t>Région cible pour le filtrage géographique (ex : Bretagne)</w:t>
+            </w:r>
+          </w:p>
+        </w:tc>
+      </w:tr>
     </w:tbl>
     <w:p>
       <w:pPr>
@@ -4473,15 +3998,7 @@
         <w:spacing w:after="100"/>
       </w:pPr>
       <w:r>
-        <w:t>Passer à un index FAISS IVF avec quantification (</w:t>
-      </w:r>
-      <w:proofErr w:type="spellStart"/>
-      <w:r>
-        <w:t>IndexIVFPQ</w:t>
-      </w:r>
-      <w:proofErr w:type="spellEnd"/>
-      <w:r>
-        <w:t>) pour supporter des volumes &gt; 100 000 événements</w:t>
+        <w:t>Passer à un index FAISS IVF avec quantification (IndexIVFPQ) pour supporter des volumes &gt; 100 000 événements</w:t>
       </w:r>
     </w:p>
     <w:p>
@@ -4507,15 +4024,7 @@
         <w:spacing w:after="100"/>
       </w:pPr>
       <w:r>
-        <w:t xml:space="preserve">Ajouter un </w:t>
-      </w:r>
-      <w:proofErr w:type="spellStart"/>
-      <w:r>
-        <w:t>reranking</w:t>
-      </w:r>
-      <w:proofErr w:type="spellEnd"/>
-      <w:r>
-        <w:t xml:space="preserve"> des résultats FAISS avant génération pour améliorer la pertinence</w:t>
+        <w:t>Ajouter un reranking des résultats FAISS avant génération pour améliorer la pertinence</w:t>
       </w:r>
     </w:p>
     <w:p>
@@ -4549,15 +4058,7 @@
         <w:spacing w:after="100"/>
       </w:pPr>
       <w:r>
-        <w:t xml:space="preserve">Migrer la base vectorielle vers une solution managée (Pinecone, Weaviate ou </w:t>
-      </w:r>
-      <w:proofErr w:type="spellStart"/>
-      <w:r>
-        <w:t>Qdrant</w:t>
-      </w:r>
-      <w:proofErr w:type="spellEnd"/>
-      <w:r>
-        <w:t>) pour la production</w:t>
+        <w:t>Migrer la base vectorielle vers une solution managée (Pinecone, Weaviate ou Qdrant) pour la production</w:t>
       </w:r>
     </w:p>
     <w:p>
@@ -4596,23 +4097,7 @@
         <w:spacing w:after="100"/>
       </w:pPr>
       <w:r>
-        <w:t>Intégrer d'autres sources de données (</w:t>
-      </w:r>
-      <w:proofErr w:type="spellStart"/>
-      <w:r>
-        <w:t>Billetweb</w:t>
-      </w:r>
-      <w:proofErr w:type="spellEnd"/>
-      <w:r>
-        <w:t xml:space="preserve">, </w:t>
-      </w:r>
-      <w:proofErr w:type="spellStart"/>
-      <w:r>
-        <w:t>Shotgun</w:t>
-      </w:r>
-      <w:proofErr w:type="spellEnd"/>
-      <w:r>
-        <w:t>) pour enrichir le corpus</w:t>
+        <w:t>Intégrer d'autres sources de données (Billetweb, Shotgun) pour enrichir le corpus</w:t>
       </w:r>
     </w:p>
     <w:p>
@@ -4659,15 +4144,7 @@
         <w:spacing w:after="100"/>
       </w:pPr>
       <w:r>
-        <w:t>Le modèle mistral-</w:t>
-      </w:r>
-      <w:proofErr w:type="spellStart"/>
-      <w:r>
-        <w:t>small</w:t>
-      </w:r>
-      <w:proofErr w:type="spellEnd"/>
-      <w:r>
-        <w:t xml:space="preserve"> peut halluciner sur des événements très récents non encore indexés</w:t>
+        <w:t>Le modèle mistral-large-latest peut halluciner sur des événements très récents non encore indexés</w:t>
       </w:r>
     </w:p>
     <w:p>
@@ -4688,23 +4165,7 @@
         <w:spacing w:after="160"/>
       </w:pPr>
       <w:r>
-        <w:t xml:space="preserve">Ce POC démontre la faisabilité technique d'un assistant RAG appliqué à la recommandation d'événements culturels. L'architecture choisie — Open Agenda + Mistral Embeddings + FAISS + </w:t>
-      </w:r>
-      <w:proofErr w:type="spellStart"/>
-      <w:r>
-        <w:t>LangChain</w:t>
-      </w:r>
-      <w:proofErr w:type="spellEnd"/>
-      <w:r>
-        <w:t xml:space="preserve"> + </w:t>
-      </w:r>
-      <w:proofErr w:type="spellStart"/>
-      <w:r>
-        <w:t>Streamlit</w:t>
-      </w:r>
-      <w:proofErr w:type="spellEnd"/>
-      <w:r>
-        <w:t xml:space="preserve"> — offre un bon équilibre entre performance, coût et rapidité de mise en œuvre.</w:t>
+        <w:t>Ce POC démontre la faisabilité technique d'un assistant RAG appliqué à la recommandation d'événements culturels. L'architecture choisie — Open Agenda + Mistral Embeddings + FAISS + LangChain + Streamlit — offre un bon équilibre entre performance, coût et rapidité de mise en œuvre.</w:t>
       </w:r>
     </w:p>
     <w:p>
@@ -4712,15 +4173,7 @@
         <w:spacing w:after="160"/>
       </w:pPr>
       <w:r>
-        <w:t xml:space="preserve">Les composants retenus sont tous open-source ou accessibles via des APIs à faible coût, ce qui facilite le déploiement à plus grande échelle. La structure modulaire du code permet de remplacer chaque composant indépendamment (autre LLM, autre vector store, autre source de données) sans </w:t>
-      </w:r>
-      <w:proofErr w:type="spellStart"/>
-      <w:r>
-        <w:t>refactoring</w:t>
-      </w:r>
-      <w:proofErr w:type="spellEnd"/>
-      <w:r>
-        <w:t xml:space="preserve"> majeur.</w:t>
+        <w:t>Les composants retenus sont tous open-source ou accessibles via des APIs à faible coût, ce qui facilite le déploiement à plus grande échelle. La structure modulaire du code permet de remplacer chaque composant indépendamment (autre LLM, autre vector store, autre source de données) sans refactoring majeur.</w:t>
       </w:r>
     </w:p>
     <w:p>
@@ -4965,7 +4418,7 @@
                 <w:sz w:val="20"/>
                 <w:szCs w:val="20"/>
               </w:rPr>
-              <w:t>3.10+</w:t>
+              <w:t>3.11+</w:t>
             </w:r>
           </w:p>
         </w:tc>
@@ -5029,25 +4482,7 @@
                 <w:sz w:val="20"/>
                 <w:szCs w:val="20"/>
               </w:rPr>
-              <w:t>Mistral AI (mistral-</w:t>
-            </w:r>
-            <w:proofErr w:type="spellStart"/>
-            <w:r>
-              <w:rPr>
-                <w:color w:val="000000"/>
-                <w:sz w:val="20"/>
-                <w:szCs w:val="20"/>
-              </w:rPr>
-              <w:t>embed</w:t>
-            </w:r>
-            <w:proofErr w:type="spellEnd"/>
-            <w:r>
-              <w:rPr>
-                <w:color w:val="000000"/>
-                <w:sz w:val="20"/>
-                <w:szCs w:val="20"/>
-              </w:rPr>
-              <w:t>)</w:t>
+              <w:t>Mistral AI (mistral-embed)</w:t>
             </w:r>
           </w:p>
         </w:tc>
@@ -5139,43 +4574,7 @@
                 <w:sz w:val="20"/>
                 <w:szCs w:val="20"/>
               </w:rPr>
-              <w:t>Mistral AI (mistral-</w:t>
-            </w:r>
-            <w:proofErr w:type="spellStart"/>
-            <w:r>
-              <w:rPr>
-                <w:color w:val="000000"/>
-                <w:sz w:val="20"/>
-                <w:szCs w:val="20"/>
-              </w:rPr>
-              <w:t>small</w:t>
-            </w:r>
-            <w:proofErr w:type="spellEnd"/>
-            <w:r>
-              <w:rPr>
-                <w:color w:val="000000"/>
-                <w:sz w:val="20"/>
-                <w:szCs w:val="20"/>
-              </w:rPr>
-              <w:t>-</w:t>
-            </w:r>
-            <w:proofErr w:type="spellStart"/>
-            <w:r>
-              <w:rPr>
-                <w:color w:val="000000"/>
-                <w:sz w:val="20"/>
-                <w:szCs w:val="20"/>
-              </w:rPr>
-              <w:t>latest</w:t>
-            </w:r>
-            <w:proofErr w:type="spellEnd"/>
-            <w:r>
-              <w:rPr>
-                <w:color w:val="000000"/>
-                <w:sz w:val="20"/>
-                <w:szCs w:val="20"/>
-              </w:rPr>
-              <w:t>)</w:t>
+              <w:t>Mistral AI (mistral-large-latest)</w:t>
             </w:r>
           </w:p>
         </w:tc>
@@ -5267,25 +4666,7 @@
                 <w:sz w:val="20"/>
                 <w:szCs w:val="20"/>
               </w:rPr>
-              <w:t>FAISS (</w:t>
-            </w:r>
-            <w:proofErr w:type="spellStart"/>
-            <w:r>
-              <w:rPr>
-                <w:color w:val="000000"/>
-                <w:sz w:val="20"/>
-                <w:szCs w:val="20"/>
-              </w:rPr>
-              <w:t>faiss-cpu</w:t>
-            </w:r>
-            <w:proofErr w:type="spellEnd"/>
-            <w:r>
-              <w:rPr>
-                <w:color w:val="000000"/>
-                <w:sz w:val="20"/>
-                <w:szCs w:val="20"/>
-              </w:rPr>
-              <w:t>)</w:t>
+              <w:t>FAISS (faiss-cpu)</w:t>
             </w:r>
           </w:p>
         </w:tc>
@@ -5371,7 +4752,6 @@
             </w:tcMar>
           </w:tcPr>
           <w:p>
-            <w:proofErr w:type="spellStart"/>
             <w:r>
               <w:rPr>
                 <w:color w:val="000000"/>
@@ -5380,7 +4760,6 @@
               </w:rPr>
               <w:t>LangChain</w:t>
             </w:r>
-            <w:proofErr w:type="spellEnd"/>
           </w:p>
         </w:tc>
         <w:tc>
@@ -5465,7 +4844,6 @@
             </w:tcMar>
           </w:tcPr>
           <w:p>
-            <w:proofErr w:type="spellStart"/>
             <w:r>
               <w:rPr>
                 <w:color w:val="000000"/>
@@ -5474,7 +4852,6 @@
               </w:rPr>
               <w:t>Streamlit</w:t>
             </w:r>
-            <w:proofErr w:type="spellEnd"/>
           </w:p>
         </w:tc>
         <w:tc>
@@ -5623,7 +5000,6 @@
             </w:tcMar>
           </w:tcPr>
           <w:p>
-            <w:proofErr w:type="spellStart"/>
             <w:r>
               <w:rPr>
                 <w:color w:val="000000"/>
@@ -5632,7 +5008,6 @@
               </w:rPr>
               <w:t>Evaluation</w:t>
             </w:r>
-            <w:proofErr w:type="spellEnd"/>
           </w:p>
         </w:tc>
         <w:tc>
@@ -5659,18 +5034,8 @@
                 <w:sz w:val="20"/>
                 <w:szCs w:val="20"/>
               </w:rPr>
-              <w:t>sentence-</w:t>
-            </w:r>
-            <w:proofErr w:type="spellStart"/>
-            <w:r>
-              <w:rPr>
-                <w:color w:val="000000"/>
-                <w:sz w:val="20"/>
-                <w:szCs w:val="20"/>
-              </w:rPr>
-              <w:t>transformers</w:t>
-            </w:r>
-            <w:proofErr w:type="spellEnd"/>
+              <w:t>Mistral AI (LLM-as-a-judge)</w:t>
+            </w:r>
           </w:p>
         </w:tc>
         <w:tc>
@@ -5697,7 +5062,7 @@
                 <w:sz w:val="20"/>
                 <w:szCs w:val="20"/>
               </w:rPr>
-              <w:t>2.x</w:t>
+              <w:t>API v1</w:t>
             </w:r>
           </w:p>
         </w:tc>
@@ -5755,7 +5120,6 @@
             </w:tcMar>
           </w:tcPr>
           <w:p>
-            <w:proofErr w:type="spellStart"/>
             <w:r>
               <w:rPr>
                 <w:color w:val="000000"/>
@@ -5764,7 +5128,6 @@
               </w:rPr>
               <w:t>pytest</w:t>
             </w:r>
-            <w:proofErr w:type="spellEnd"/>
           </w:p>
         </w:tc>
         <w:tc>
@@ -5935,7 +5298,7 @@
                 <w:sz w:val="20"/>
                 <w:szCs w:val="20"/>
               </w:rPr>
-              <w:t>src/config.py</w:t>
+              <w:t>src/data_collection/open_agenda_client.py</w:t>
             </w:r>
           </w:p>
         </w:tc>
@@ -5963,7 +5326,7 @@
                 <w:sz w:val="20"/>
                 <w:szCs w:val="20"/>
               </w:rPr>
-              <w:t>Clés API, ville (Rennes), paramètres RAG</w:t>
+              <w:t>Appel API Open Agenda, pagination, filtrage géo/date</w:t>
             </w:r>
           </w:p>
         </w:tc>
@@ -5999,7 +5362,7 @@
                 <w:sz w:val="20"/>
                 <w:szCs w:val="20"/>
               </w:rPr>
-              <w:t>src/ingestion.py</w:t>
+              <w:t>src/data_collection/preprocessor.py</w:t>
             </w:r>
           </w:p>
         </w:tc>
@@ -6027,7 +5390,7 @@
                 <w:sz w:val="20"/>
                 <w:szCs w:val="20"/>
               </w:rPr>
-              <w:t>Appel API Open Agenda + filtrage</w:t>
+              <w:t>Nettoyage, construction DataFrame, export CSV</w:t>
             </w:r>
           </w:p>
         </w:tc>
@@ -6063,7 +5426,7 @@
                 <w:sz w:val="20"/>
                 <w:szCs w:val="20"/>
               </w:rPr>
-              <w:t>src/preprocessing.py</w:t>
+              <w:t>src/vectorstore/embeddings.py</w:t>
             </w:r>
           </w:p>
         </w:tc>
@@ -6091,18 +5454,8 @@
                 <w:sz w:val="20"/>
                 <w:szCs w:val="20"/>
               </w:rPr>
-              <w:t xml:space="preserve">Nettoyage + </w:t>
-            </w:r>
-            <w:proofErr w:type="spellStart"/>
-            <w:r>
-              <w:rPr>
-                <w:color w:val="000000"/>
-                <w:sz w:val="20"/>
-                <w:szCs w:val="20"/>
-              </w:rPr>
-              <w:t>chunking</w:t>
-            </w:r>
-            <w:proofErr w:type="spellEnd"/>
+              <w:t>Modèle MistralAIEmbeddings (mistral-embed)</w:t>
+            </w:r>
           </w:p>
         </w:tc>
       </w:tr>
@@ -6137,7 +5490,7 @@
                 <w:sz w:val="20"/>
                 <w:szCs w:val="20"/>
               </w:rPr>
-              <w:t>src/vectorization.py</w:t>
+              <w:t>src/vectorstore/faiss_store.py</w:t>
             </w:r>
           </w:p>
         </w:tc>
@@ -6165,7 +5518,7 @@
                 <w:sz w:val="20"/>
                 <w:szCs w:val="20"/>
               </w:rPr>
-              <w:t>Génération embeddings Mistral</w:t>
+              <w:t>Construction et requête index FAISS</w:t>
             </w:r>
           </w:p>
         </w:tc>
@@ -6201,7 +5554,7 @@
                 <w:sz w:val="20"/>
                 <w:szCs w:val="20"/>
               </w:rPr>
-              <w:t>src/vector_store.py</w:t>
+              <w:t>src/rag/chain.py</w:t>
             </w:r>
           </w:p>
         </w:tc>
@@ -6229,7 +5582,7 @@
                 <w:sz w:val="20"/>
                 <w:szCs w:val="20"/>
               </w:rPr>
-              <w:t>Construction et requête FAISS</w:t>
+              <w:t>Orchestration LangChain + Mistral LLM, prompt, retriever</w:t>
             </w:r>
           </w:p>
         </w:tc>
@@ -6265,7 +5618,7 @@
                 <w:sz w:val="20"/>
                 <w:szCs w:val="20"/>
               </w:rPr>
-              <w:t>src/rag_chain.py</w:t>
+              <w:t>src/rag/chatbot.py</w:t>
             </w:r>
           </w:p>
         </w:tc>
@@ -6293,18 +5646,8 @@
                 <w:sz w:val="20"/>
                 <w:szCs w:val="20"/>
               </w:rPr>
-              <w:t xml:space="preserve">Orchestration </w:t>
-            </w:r>
-            <w:proofErr w:type="spellStart"/>
-            <w:r>
-              <w:rPr>
-                <w:color w:val="000000"/>
-                <w:sz w:val="20"/>
-                <w:szCs w:val="20"/>
-              </w:rPr>
-              <w:t>LangChain</w:t>
-            </w:r>
-            <w:proofErr w:type="spellEnd"/>
+              <w:t>Formatage des sources pour Streamlit</w:t>
+            </w:r>
           </w:p>
         </w:tc>
       </w:tr>
@@ -6339,7 +5682,7 @@
                 <w:sz w:val="20"/>
                 <w:szCs w:val="20"/>
               </w:rPr>
-              <w:t>src/chatbot.py</w:t>
+              <w:t>app.py</w:t>
             </w:r>
           </w:p>
         </w:tc>
@@ -6367,18 +5710,8 @@
                 <w:sz w:val="20"/>
                 <w:szCs w:val="20"/>
               </w:rPr>
-              <w:t xml:space="preserve">Logique </w:t>
-            </w:r>
-            <w:proofErr w:type="spellStart"/>
-            <w:r>
-              <w:rPr>
-                <w:color w:val="000000"/>
-                <w:sz w:val="20"/>
-                <w:szCs w:val="20"/>
-              </w:rPr>
-              <w:t>chatbot</w:t>
-            </w:r>
-            <w:proofErr w:type="spellEnd"/>
+              <w:t>Interface Streamlit, historique, cache FAISS</w:t>
+            </w:r>
           </w:p>
         </w:tc>
       </w:tr>
@@ -6413,7 +5746,7 @@
                 <w:sz w:val="20"/>
                 <w:szCs w:val="20"/>
               </w:rPr>
-              <w:t>streamlit/app.py</w:t>
+              <w:t>scripts/build_vectorstore.py</w:t>
             </w:r>
           </w:p>
         </w:tc>
@@ -6441,18 +5774,8 @@
                 <w:sz w:val="20"/>
                 <w:szCs w:val="20"/>
               </w:rPr>
-              <w:t xml:space="preserve">Interface </w:t>
-            </w:r>
-            <w:proofErr w:type="spellStart"/>
-            <w:r>
-              <w:rPr>
-                <w:color w:val="000000"/>
-                <w:sz w:val="20"/>
-                <w:szCs w:val="20"/>
-              </w:rPr>
-              <w:t>Streamlit</w:t>
-            </w:r>
-            <w:proofErr w:type="spellEnd"/>
+              <w:t>Script d’orchestration (collecte → vectorstore)</w:t>
+            </w:r>
           </w:p>
         </w:tc>
       </w:tr>
@@ -6487,7 +5810,7 @@
                 <w:sz w:val="20"/>
                 <w:szCs w:val="20"/>
               </w:rPr>
-              <w:t>scripts/build_index.py</w:t>
+              <w:t>scripts/run_chatbot.py</w:t>
             </w:r>
           </w:p>
         </w:tc>
@@ -6515,7 +5838,7 @@
                 <w:sz w:val="20"/>
                 <w:szCs w:val="20"/>
               </w:rPr>
-              <w:t>Reconstruction index FAISS</w:t>
+              <w:t>Lance l’application Streamlit via subprocess</w:t>
             </w:r>
           </w:p>
         </w:tc>
@@ -6551,18 +5874,8 @@
                 <w:sz w:val="20"/>
                 <w:szCs w:val="20"/>
               </w:rPr>
-              <w:t>tests/</w:t>
-            </w:r>
-            <w:proofErr w:type="spellStart"/>
-            <w:r>
-              <w:rPr>
-                <w:color w:val="000000"/>
-                <w:sz w:val="20"/>
-                <w:szCs w:val="20"/>
-              </w:rPr>
-              <w:t>eval_dataset.json</w:t>
-            </w:r>
-            <w:proofErr w:type="spellEnd"/>
+              <w:t>data/processed/qa_dataset.json</w:t>
+            </w:r>
           </w:p>
         </w:tc>
         <w:tc>
@@ -6589,7 +5902,7 @@
                 <w:sz w:val="20"/>
                 <w:szCs w:val="20"/>
               </w:rPr>
-              <w:t>Jeu de données annoté</w:t>
+              <w:t>Jeu de données Q/R généré automatiquement (20 paires)</w:t>
             </w:r>
           </w:p>
         </w:tc>

</xml_diff>